<commit_message>
chore(testFile): update the file for the tests
</commit_message>
<xml_diff>
--- a/DocumentTest/FileTest.docx
+++ b/DocumentTest/FileTest.docx
@@ -35,6 +35,14 @@
         </w:rPr>
         <w:t>Client: Jane Doe</w:t>
       </w:r>
+      <w:r>
+        <w:rPr>
+          <w:b/>
+          <w:bCs/>
+          <w:lang w:val="en-US"/>
+        </w:rPr>
+        <w:t>.</w:t>
+      </w:r>
     </w:p>
     <w:p>
       <w:pPr>
@@ -50,18 +58,8 @@
           <w:bCs/>
           <w:lang w:val="en-US"/>
         </w:rPr>
-        <w:t xml:space="preserve">Email: </w:t>
+        <w:t>Email: jane.doe@acme.corp</w:t>
       </w:r>
-      <w:proofErr w:type="spellStart"/>
-      <w:r>
-        <w:rPr>
-          <w:b/>
-          <w:bCs/>
-          <w:lang w:val="en-US"/>
-        </w:rPr>
-        <w:t>jane.doe@acme.corp</w:t>
-      </w:r>
-      <w:proofErr w:type="spellEnd"/>
     </w:p>
     <w:p>
       <w:pPr>
@@ -101,25 +99,7 @@
           <w:bCs/>
           <w:lang w:val="en-US"/>
         </w:rPr>
-        <w:t xml:space="preserve">Notes: Jane Doe requested an account access reset for </w:t>
-      </w:r>
-      <w:proofErr w:type="spellStart"/>
-      <w:r>
-        <w:rPr>
-          <w:b/>
-          <w:bCs/>
-          <w:lang w:val="en-US"/>
-        </w:rPr>
-        <w:t>jane.doe@acme.corp</w:t>
-      </w:r>
-      <w:proofErr w:type="spellEnd"/>
-      <w:r>
-        <w:rPr>
-          <w:b/>
-          <w:bCs/>
-          <w:lang w:val="en-US"/>
-        </w:rPr>
-        <w:t>.</w:t>
+        <w:t>Notes: Jane Doe requested an account access reset for jane.doe@acme.corp.</w:t>
       </w:r>
     </w:p>
     <w:sectPr>

</xml_diff>